<commit_message>
Add setup instructions, synthetic data generation script, and deck cleanup notes
- Created a new markdown file for setup instructions detailing the steps to set up the environment and run the dashboard without Tableau.
- Added a Python script to generate synthetic data that mimics the structure and characteristics of the real Infinity Excel files.
- Introduced a markdown file with specific cleanup edits for the "ATC vs Non-ATC Site of Care Analysis" PowerPoint deck, outlining precise changes to be made.
</commit_message>
<xml_diff>
--- a/PPR/August 4/PPR_Tableau_Data_Engineering_Handoff.docx
+++ b/PPR/August 4/PPR_Tableau_Data_Engineering_Handoff.docx
@@ -1354,7 +1354,7 @@
         <w:spacing w:after="60"/>
       </w:pPr>
       <w:r>
-        <w:t xml:space="preserve">The production workbook remains on the office laptop and was not available for this handoff; all workbook-specific details are marked Needs TWBX verification (see Section 14).</w:t>
+        <w:t xml:space="preserve">The production workbook has not yet been checked against this package; all workbook-specific details are marked Needs TWBX verification (see Section 14).</w:t>
       </w:r>
     </w:p>
     <w:p>
@@ -2498,7 +2498,7 @@
               <w:spacing w:after="20"/>
             </w:pPr>
             <w:r>
-              <w:t xml:space="preserve">Kolin's manual Infinity -&gt; Excel -&gt; per-center PowerPoint slide workflow. Confirmed: PPR Automation/README.md.</w:t>
+              <w:t xml:space="preserve">The manager's manual Infinity -&gt; Excel -&gt; per-center PowerPoint slide workflow. Confirmed: PPR Automation/README.md.</w:t>
             </w:r>
           </w:p>
         </w:tc>
@@ -2900,13 +2900,13 @@
         <w:spacing w:after="120"/>
       </w:pPr>
       <w:r>
-        <w:t xml:space="preserve">Figure 1 (next page, landscape) shows the whole current path. Everything runs on one office laptop: the operator </w:t>
+        <w:t xml:space="preserve">Figure 1 (next page, landscape) shows the whole current path. Everything runs on one machine: the operator </w:t>
       </w:r>
       <w:r>
         <w:t xml:space="preserve">downloads the exports, RUN_ALL.py executes the six stages in order and stops on the first failure, and Tableau </w:t>
       </w:r>
       <w:r>
-        <w:t xml:space="preserve">Desktop reads local Hyper extract files. Real Infinity data never leaves the office laptop; only code and this </w:t>
+        <w:t xml:space="preserve">Desktop reads local Hyper extract files. Real Infinity data never leaves the controlled environment; only code and this </w:t>
       </w:r>
       <w:r>
         <w:t xml:space="preserve">documentation travel through the git repository (Confirmed: git/PPR/July 27/README.md).</w:t>
@@ -3407,7 +3407,7 @@
               <w:spacing w:after="20"/>
             </w:pPr>
             <w:r>
-              <w:t xml:space="preserve">Pipeline intermediates plus the run's as-of date, input directory, synthetic flag, and metric-3 source.</w:t>
+              <w:t xml:space="preserve">Pipeline intermediates plus the run's as-of date, input directory, test-sample flag, and metric-3 source.</w:t>
             </w:r>
           </w:p>
         </w:tc>
@@ -12551,7 +12551,7 @@
         <w:spacing w:after="120"/>
       </w:pPr>
       <w:r>
-        <w:t xml:space="preserve">The exact refresh procedure as documented in git/PPR/July 27/README.md section 8 and OFFICE LAPTOP - do this.md (Confirmed):</w:t>
+        <w:t xml:space="preserve">The exact refresh procedure as documented in git/PPR/July 27/README.md section 8 and SETUP - do this.md (Confirmed):</w:t>
       </w:r>
     </w:p>
     <w:p>
@@ -12621,7 +12621,7 @@
         <w:t xml:space="preserve">python RUN_ALL.py</w:t>
       </w:r>
       <w:r>
-        <w:t xml:space="preserve"> (PowerShell on the office laptop; py -3.12 fallback because the laptop's Python 3.14 is newer than pandas/pantab reliably ship wheels for).</w:t>
+        <w:t xml:space="preserve"> (PowerShell; py -3.12 fallback where the default Python is newer than pandas/pantab reliably ship wheels for).</w:t>
       </w:r>
     </w:p>
     <w:p>
@@ -20173,7 +20173,7 @@
               <w:spacing w:after="20"/>
             </w:pPr>
             <w:r>
-              <w:t xml:space="preserve">Kolin's 31 Jul ruling encoded</w:t>
+              <w:t xml:space="preserve">The 31 Jul business ruling encoded</w:t>
             </w:r>
           </w:p>
         </w:tc>
@@ -25930,7 +25930,7 @@
         <w:spacing w:after="60"/>
       </w:pPr>
       <w:r>
-        <w:t xml:space="preserve">Exempt metrics: '2nd Resections (Scheduled or Completed)' — documented window-edge dedup case (1 cell in 3,309 on synthetic data) — and 'Patient Progression Rate' — exempt in code, acknowledged only in a code comment.</w:t>
+        <w:t xml:space="preserve">Exempt metrics: '2nd Resections (Scheduled or Completed)' — documented window-edge dedup case (1 cell in 3,309 on the test sample) — and 'Patient Progression Rate' — exempt in code, acknowledged only in a code comment.</w:t>
       </w:r>
     </w:p>
     <w:p>
@@ -25975,7 +25975,7 @@
         <w:t xml:space="preserve">col_label, metric) and ppr_datewindow_long.csv (keyed on center, metric, agg, event_date) plus hashes into a machine-local </w:t>
       </w:r>
       <w:r>
-        <w:t xml:space="preserve">baseline/ folder (never committed — on the office laptop it would contain real rows); 'diff' compares the current outputs </w:t>
+        <w:t xml:space="preserve">baseline/ folder (never committed — on real data it would contain real rows); 'diff' compares the current outputs </w:t>
       </w:r>
       <w:r>
         <w:t xml:space="preserve">cell-by-cell and prints moved / gone / new cells with a per-metric summary; verdict 'NO CHANGE. Safe.' only at zero differences. </w:t>
@@ -27843,7 +27843,7 @@
         <w:t xml:space="preserve">baseline diff shows byte-identical outputs on the proxy path, and a stub-LTD run computed Metric 3 from the 4 stub events </w:t>
       </w:r>
       <w:r>
-        <w:t xml:space="preserve">(the proxy would have produced 83). REMAINING: copy the updated pipeline to the office laptop and validate on a real LTD run.</w:t>
+        <w:t xml:space="preserve">(the proxy would have produced 83). REMAINING: validate on a real LTD run.</w:t>
       </w:r>
     </w:p>
     <w:tbl>
@@ -28158,7 +28158,7 @@
               <w:spacing w:after="20"/>
             </w:pPr>
             <w:r>
-              <w:t xml:space="preserve">Deploy to the office laptop; validate on a real LTD run</w:t>
+              <w:t xml:space="preserve">Validate on a real LTD run</w:t>
             </w:r>
           </w:p>
         </w:tc>
@@ -29344,7 +29344,7 @@
               <w:spacing w:after="20"/>
             </w:pPr>
             <w:r>
-              <w:t xml:space="preserve">Production workbook not directly verifiable here</w:t>
+              <w:t xml:space="preserve">Production workbook not yet re-verified</w:t>
             </w:r>
           </w:p>
         </w:tc>
@@ -29422,7 +29422,7 @@
               <w:spacing w:after="20"/>
             </w:pPr>
             <w:r>
-              <w:t xml:space="preserve">Run the Section 14 checklist on the office laptop</w:t>
+              <w:t xml:space="preserve">Run the Section 14 checklist in the workbook</w:t>
             </w:r>
           </w:p>
         </w:tc>
@@ -29870,7 +29870,7 @@
               <w:spacing w:after="20"/>
             </w:pPr>
             <w:r>
-              <w:t xml:space="preserve">Written runbook (OFFICE LAPTOP - do this.md)</w:t>
+              <w:t xml:space="preserve">Written runbook (SETUP - do this.md)</w:t>
             </w:r>
           </w:p>
         </w:tc>
@@ -32398,7 +32398,7 @@
         <w:t xml:space="preserve">Needs TWBX verification — this entire section. </w:t>
       </w:r>
       <w:r>
-        <w:t xml:space="preserve">The production workbook exists only on the office laptop. The 'Expected behavior' column comes from the build doc (ONE DASHBOARD - Tableau build.md) and a partial in-workbook check dated 2026-08-03; nothing here was read from the workbook itself for this handoff.</w:t>
+        <w:t xml:space="preserve">The production workbook has not been rechecked for this handoff. The 'Expected behavior' column comes from the build doc (ONE DASHBOARD - Tableau build.md) and a partial in-workbook check dated 2026-08-03; nothing here was read from the workbook itself for this handoff.</w:t>
       </w:r>
     </w:p>
     <w:tbl>
@@ -36033,7 +36033,7 @@
         <w:spacing w:after="60"/>
       </w:pPr>
       <w:r>
-        <w:t xml:space="preserve">Development, test, and production environments — a seeded synthetic generator exists (PPR Automation/synthetic_data/generate_synthetic.py) that matches the real schema, null rates, and join coverage, making a non-production environment cheap.</w:t>
+        <w:t xml:space="preserve">Development, test, and production environments — a seeded test-sample generator exists (synthetic_data/generate_synthetic.py) that matches the real schema, null rates, and join coverage, making a non-production environment cheap.</w:t>
       </w:r>
     </w:p>
     <w:p>
@@ -37601,7 +37601,7 @@
         <w:spacing w:after="60"/>
       </w:pPr>
       <w:r>
-        <w:t xml:space="preserve">Synthetic data generator exists for development and testing.</w:t>
+        <w:t xml:space="preserve">Test-sample generator exists for development and testing.</w:t>
       </w:r>
     </w:p>
     <w:p>
@@ -37623,7 +37623,7 @@
         <w:spacing w:after="60"/>
       </w:pPr>
       <w:r>
-        <w:t xml:space="preserve">Metric 3 defect: fixed in the repo 2026-08-03; deploy to the office laptop and validate on a real LTD run — Section 12.</w:t>
+        <w:t xml:space="preserve">Metric 3 defect: fixed in the repo 2026-08-03; validate on a real LTD run — Section 12.</w:t>
       </w:r>
     </w:p>
     <w:p>
@@ -37649,7 +37649,7 @@
         <w:spacing w:after="60"/>
       </w:pPr>
       <w:r>
-        <w:t xml:space="preserve">Tableau formulas verified on the office laptop — Section 14.</w:t>
+        <w:t xml:space="preserve">Tableau formulas verified in the workbook — Section 14.</w:t>
       </w:r>
     </w:p>
     <w:p>
@@ -37810,7 +37810,7 @@
         <w:spacing w:after="60"/>
       </w:pPr>
       <w:r>
-        <w:t xml:space="preserve">Verify the Tableau workbook checklist on the office laptop (Section 14 — small, one sitting).</w:t>
+        <w:t xml:space="preserve">Verify the Tableau workbook checklist (Section 14 — small, one sitting).</w:t>
       </w:r>
     </w:p>
     <w:p>
@@ -37875,7 +37875,7 @@
         <w:spacing w:after="60"/>
       </w:pPr>
       <w:r>
-        <w:t xml:space="preserve">Build a prototype using the synthetic data generator.</w:t>
+        <w:t xml:space="preserve">Build a prototype using the test-sample generator.</w:t>
       </w:r>
     </w:p>
     <w:p>
@@ -41881,7 +41881,7 @@
               <w:spacing w:after="20"/>
             </w:pPr>
             <w:r>
-              <w:t xml:space="preserve">Stage 4 re-aggregates its own event table and compares every cell to the scorecard (tolerance 0.051); the build stops on disagreement EXCEPT for two exempt metrics: '2nd Resections (Scheduled or Completed)' (documented window-edge dedup case, 1 cell in 3,309 on synthetic data) and 'Patient Progression Rate' (exempt in code, acknowledged only in a code comment — disagreements of any size on these two never stop the build).</w:t>
+              <w:t xml:space="preserve">Stage 4 re-aggregates its own event table and compares every cell to the scorecard (tolerance 0.051); the build stops on disagreement EXCEPT for two exempt metrics: '2nd Resections (Scheduled or Completed)' (documented window-edge dedup case, 1 cell in 3,309 on the test sample) and 'Patient Progression Rate' (exempt in code, acknowledged only in a code comment — disagreements of any size on these two never stop the build).</w:t>
             </w:r>
           </w:p>
         </w:tc>
@@ -41974,7 +41974,7 @@
         <w:spacing w:after="120"/>
       </w:pPr>
       <w:r>
-        <w:t xml:space="preserve">Consolidated reference for every dataset in the model. Row counts and null rates come from the real-data schema profile and live Infinity table notes (office laptop), not from the synthetic sample; they are dataset-level only.</w:t>
+        <w:t xml:space="preserve">Consolidated reference for every dataset in the model. Row counts and null rates come from the real-data schema profile and live Infinity table notes, not from the test sample; they are dataset-level only.</w:t>
       </w:r>
     </w:p>
     <w:tbl>
@@ -47748,7 +47748,7 @@
               <w:spacing w:after="20"/>
             </w:pPr>
             <w:r>
-              <w:t xml:space="preserve">git/PPR/July 27/README.md; OFFICE LAPTOP - do this.md</w:t>
+              <w:t xml:space="preserve">git/PPR/July 27/README.md; SETUP - do this.md</w:t>
             </w:r>
           </w:p>
         </w:tc>
@@ -48066,7 +48066,7 @@
               <w:spacing w:after="20"/>
             </w:pPr>
             <w:r>
-              <w:t xml:space="preserve">PPR Automation/Infinity schema profile (from office laptop).md</w:t>
+              <w:t xml:space="preserve">Infinity schema profile.md</w:t>
             </w:r>
           </w:p>
         </w:tc>

</xml_diff>